<commit_message>
Redesign web UI with a premium, Apple-style look; refresh screenshots and report
Co-Authored-By: Claude Sonnet 5.5 <noreply@anthropic.com>
Claude-Session: https://claude.ai/code/session_01GtPcDJLiBtC54H93jMoEqQ
</commit_message>
<xml_diff>
--- a/student-recommendation-platform/report/Software_Engineering_Mini_Project_Report.docx
+++ b/student-recommendation-platform/report/Software_Engineering_Mini_Project_Report.docx
@@ -3361,7 +3361,7 @@
             <w:r>
               <w:drawing>
                 <wp:inline xmlns:a="http://schemas.openxmlformats.org/drawingml/2006/main" xmlns:pic="http://schemas.openxmlformats.org/drawingml/2006/picture">
-                  <wp:extent cx="2926080" cy="3119499"/>
+                  <wp:extent cx="2926080" cy="4084113"/>
                   <wp:docPr id="7" name="Picture 7"/>
                   <wp:cNvGraphicFramePr>
                     <a:graphicFrameLocks noChangeAspect="1"/>
@@ -3382,7 +3382,7 @@
                         <pic:spPr>
                           <a:xfrm>
                             <a:off x="0" y="0"/>
-                            <a:ext cx="2926080" cy="3119499"/>
+                            <a:ext cx="2926080" cy="4084113"/>
                           </a:xfrm>
                           <a:prstGeom prst="rect"/>
                         </pic:spPr>
@@ -3405,7 +3405,7 @@
             <w:r>
               <w:drawing>
                 <wp:inline xmlns:a="http://schemas.openxmlformats.org/drawingml/2006/main" xmlns:pic="http://schemas.openxmlformats.org/drawingml/2006/picture">
-                  <wp:extent cx="2377440" cy="3348564"/>
+                  <wp:extent cx="2377440" cy="4640038"/>
                   <wp:docPr id="8" name="Picture 8"/>
                   <wp:cNvGraphicFramePr>
                     <a:graphicFrameLocks noChangeAspect="1"/>
@@ -3426,7 +3426,7 @@
                         <pic:spPr>
                           <a:xfrm>
                             <a:off x="0" y="0"/>
-                            <a:ext cx="2377440" cy="3348564"/>
+                            <a:ext cx="2377440" cy="4640038"/>
                           </a:xfrm>
                           <a:prstGeom prst="rect"/>
                         </pic:spPr>
@@ -3512,7 +3512,7 @@
             <w:r>
               <w:drawing>
                 <wp:inline xmlns:a="http://schemas.openxmlformats.org/drawingml/2006/main" xmlns:pic="http://schemas.openxmlformats.org/drawingml/2006/picture">
-                  <wp:extent cx="2834640" cy="3022015"/>
+                  <wp:extent cx="2834640" cy="3901233"/>
                   <wp:docPr id="9" name="Picture 9"/>
                   <wp:cNvGraphicFramePr>
                     <a:graphicFrameLocks noChangeAspect="1"/>
@@ -3533,7 +3533,7 @@
                         <pic:spPr>
                           <a:xfrm>
                             <a:off x="0" y="0"/>
-                            <a:ext cx="2834640" cy="3022015"/>
+                            <a:ext cx="2834640" cy="3901233"/>
                           </a:xfrm>
                           <a:prstGeom prst="rect"/>
                         </pic:spPr>
@@ -3556,7 +3556,7 @@
             <w:r>
               <w:drawing>
                 <wp:inline xmlns:a="http://schemas.openxmlformats.org/drawingml/2006/main" xmlns:pic="http://schemas.openxmlformats.org/drawingml/2006/picture">
-                  <wp:extent cx="2834640" cy="2853858"/>
+                  <wp:extent cx="2834640" cy="2193243"/>
                   <wp:docPr id="10" name="Picture 10"/>
                   <wp:cNvGraphicFramePr>
                     <a:graphicFrameLocks noChangeAspect="1"/>
@@ -3577,7 +3577,7 @@
                         <pic:spPr>
                           <a:xfrm>
                             <a:off x="0" y="0"/>
-                            <a:ext cx="2834640" cy="2853858"/>
+                            <a:ext cx="2834640" cy="2193243"/>
                           </a:xfrm>
                           <a:prstGeom prst="rect"/>
                         </pic:spPr>

</xml_diff>

<commit_message>
Add teammates to report, README and site footer
Co-Authored-By: Claude Sonnet 5.5 <noreply@anthropic.com>
Claude-Session: https://claude.ai/code/session_01GtPcDJLiBtC54H93jMoEqQ
</commit_message>
<xml_diff>
--- a/student-recommendation-platform/report/Software_Engineering_Mini_Project_Report.docx
+++ b/student-recommendation-platform/report/Software_Engineering_Mini_Project_Report.docx
@@ -99,6 +99,180 @@
         <w:tblLook w:firstColumn="1" w:firstRow="1" w:lastColumn="0" w:lastRow="0" w:noHBand="0" w:noVBand="1" w:val="04A0"/>
       </w:tblPr>
       <w:tblGrid>
+        <w:gridCol w:w="4608"/>
+        <w:gridCol w:w="3456"/>
+      </w:tblGrid>
+      <w:tr>
+        <w:trPr>
+          <w:cantSplit/>
+        </w:trPr>
+        <w:tc>
+          <w:tcPr>
+            <w:tcW w:type="dxa" w:w="4608"/>
+            <w:shd w:val="clear" w:color="auto" w:fill="1E3A8A"/>
+          </w:tcPr>
+          <w:p>
+            <w:r/>
+            <w:r>
+              <w:rPr>
+                <w:b/>
+                <w:color w:val="FFFFFF"/>
+                <w:sz w:val="17"/>
+              </w:rPr>
+              <w:t>Project team</w:t>
+            </w:r>
+          </w:p>
+        </w:tc>
+        <w:tc>
+          <w:tcPr>
+            <w:tcW w:type="dxa" w:w="3456"/>
+            <w:shd w:val="clear" w:color="auto" w:fill="1E3A8A"/>
+          </w:tcPr>
+          <w:p>
+            <w:r/>
+            <w:r>
+              <w:rPr>
+                <w:b/>
+                <w:color w:val="FFFFFF"/>
+                <w:sz w:val="17"/>
+              </w:rPr>
+              <w:t>Roll number</w:t>
+            </w:r>
+          </w:p>
+        </w:tc>
+      </w:tr>
+      <w:tr>
+        <w:trPr>
+          <w:cantSplit/>
+        </w:trPr>
+        <w:tc>
+          <w:tcPr>
+            <w:tcW w:type="dxa" w:w="4608"/>
+          </w:tcPr>
+          <w:p>
+            <w:pPr>
+              <w:spacing w:after="0"/>
+            </w:pPr>
+            <w:r/>
+            <w:r>
+              <w:rPr>
+                <w:sz w:val="17"/>
+              </w:rPr>
+              <w:t>Krishang Vikram Singh</w:t>
+            </w:r>
+          </w:p>
+        </w:tc>
+        <w:tc>
+          <w:tcPr>
+            <w:tcW w:type="dxa" w:w="3456"/>
+          </w:tcPr>
+          <w:p>
+            <w:pPr>
+              <w:spacing w:after="0"/>
+            </w:pPr>
+            <w:r/>
+            <w:r>
+              <w:rPr>
+                <w:sz w:val="17"/>
+              </w:rPr>
+              <w:t>B106</w:t>
+            </w:r>
+          </w:p>
+        </w:tc>
+      </w:tr>
+      <w:tr>
+        <w:trPr>
+          <w:cantSplit/>
+        </w:trPr>
+        <w:tc>
+          <w:tcPr>
+            <w:tcW w:type="dxa" w:w="4608"/>
+          </w:tcPr>
+          <w:p>
+            <w:pPr>
+              <w:spacing w:after="0"/>
+            </w:pPr>
+            <w:r/>
+            <w:r>
+              <w:rPr>
+                <w:sz w:val="17"/>
+              </w:rPr>
+              <w:t>Samarendra Padaki</w:t>
+            </w:r>
+          </w:p>
+        </w:tc>
+        <w:tc>
+          <w:tcPr>
+            <w:tcW w:type="dxa" w:w="3456"/>
+          </w:tcPr>
+          <w:p>
+            <w:pPr>
+              <w:spacing w:after="0"/>
+            </w:pPr>
+            <w:r/>
+            <w:r>
+              <w:rPr>
+                <w:sz w:val="17"/>
+              </w:rPr>
+              <w:t>B067</w:t>
+            </w:r>
+          </w:p>
+        </w:tc>
+      </w:tr>
+      <w:tr>
+        <w:trPr>
+          <w:cantSplit/>
+        </w:trPr>
+        <w:tc>
+          <w:tcPr>
+            <w:tcW w:type="dxa" w:w="4608"/>
+          </w:tcPr>
+          <w:p>
+            <w:pPr>
+              <w:spacing w:after="0"/>
+            </w:pPr>
+            <w:r/>
+            <w:r>
+              <w:rPr>
+                <w:sz w:val="17"/>
+              </w:rPr>
+              <w:t>Riya Saitwal</w:t>
+            </w:r>
+          </w:p>
+        </w:tc>
+        <w:tc>
+          <w:tcPr>
+            <w:tcW w:type="dxa" w:w="3456"/>
+          </w:tcPr>
+          <w:p>
+            <w:pPr>
+              <w:spacing w:after="0"/>
+            </w:pPr>
+            <w:r/>
+            <w:r>
+              <w:rPr>
+                <w:sz w:val="17"/>
+              </w:rPr>
+              <w:t>B081</w:t>
+            </w:r>
+          </w:p>
+        </w:tc>
+      </w:tr>
+    </w:tbl>
+    <w:p>
+      <w:pPr>
+        <w:spacing w:after="40"/>
+      </w:pPr>
+    </w:p>
+    <w:tbl>
+      <w:tblPr>
+        <w:tblStyle w:val="TableGrid"/>
+        <w:tblW w:type="auto" w:w="0"/>
+        <w:jc w:val="center"/>
+        <w:tblLayout w:type="fixed"/>
+        <w:tblLook w:firstColumn="1" w:firstRow="1" w:lastColumn="0" w:lastRow="0" w:noHBand="0" w:noVBand="1" w:val="04A0"/>
+      </w:tblPr>
+      <w:tblGrid>
         <w:gridCol w:w="2880"/>
         <w:gridCol w:w="5184"/>
       </w:tblGrid>
@@ -119,7 +293,7 @@
                 <w:color w:val="FFFFFF"/>
                 <w:sz w:val="17"/>
               </w:rPr>
-              <w:t>Project author</w:t>
+              <w:t>Details</w:t>
             </w:r>
           </w:p>
         </w:tc>
@@ -157,85 +331,7 @@
               <w:rPr>
                 <w:sz w:val="17"/>
               </w:rPr>
-              <w:t>Name</w:t>
-            </w:r>
-          </w:p>
-        </w:tc>
-        <w:tc>
-          <w:tcPr>
-            <w:tcW w:type="dxa" w:w="5184"/>
-          </w:tcPr>
-          <w:p>
-            <w:pPr>
-              <w:spacing w:after="0"/>
-            </w:pPr>
-            <w:r/>
-            <w:r>
-              <w:rPr>
-                <w:sz w:val="17"/>
-              </w:rPr>
-              <w:t>Krishang Vikram Singh</w:t>
-            </w:r>
-          </w:p>
-        </w:tc>
-      </w:tr>
-      <w:tr>
-        <w:trPr>
-          <w:cantSplit/>
-        </w:trPr>
-        <w:tc>
-          <w:tcPr>
-            <w:tcW w:type="dxa" w:w="2880"/>
-          </w:tcPr>
-          <w:p>
-            <w:pPr>
-              <w:spacing w:after="0"/>
-            </w:pPr>
-            <w:r/>
-            <w:r>
-              <w:rPr>
-                <w:sz w:val="17"/>
-              </w:rPr>
-              <w:t>Roll number</w:t>
-            </w:r>
-          </w:p>
-        </w:tc>
-        <w:tc>
-          <w:tcPr>
-            <w:tcW w:type="dxa" w:w="5184"/>
-          </w:tcPr>
-          <w:p>
-            <w:pPr>
-              <w:spacing w:after="0"/>
-            </w:pPr>
-            <w:r/>
-            <w:r>
-              <w:rPr>
-                <w:sz w:val="17"/>
-              </w:rPr>
-              <w:t>B106</w:t>
-            </w:r>
-          </w:p>
-        </w:tc>
-      </w:tr>
-      <w:tr>
-        <w:trPr>
-          <w:cantSplit/>
-        </w:trPr>
-        <w:tc>
-          <w:tcPr>
-            <w:tcW w:type="dxa" w:w="2880"/>
-          </w:tcPr>
-          <w:p>
-            <w:pPr>
-              <w:spacing w:after="0"/>
-            </w:pPr>
-            <w:r/>
-            <w:r>
-              <w:rPr>
-                <w:sz w:val="17"/>
-              </w:rPr>
-              <w:t>Batch</w:t>
+              <w:t>Batch (Krishang Vikram Singh)</w:t>
             </w:r>
           </w:p>
         </w:tc>
@@ -331,45 +427,6 @@
                 <w:sz w:val="17"/>
               </w:rPr>
               <w:t>Software Engineering</w:t>
-            </w:r>
-          </w:p>
-        </w:tc>
-      </w:tr>
-      <w:tr>
-        <w:trPr>
-          <w:cantSplit/>
-        </w:trPr>
-        <w:tc>
-          <w:tcPr>
-            <w:tcW w:type="dxa" w:w="2880"/>
-          </w:tcPr>
-          <w:p>
-            <w:pPr>
-              <w:spacing w:after="0"/>
-            </w:pPr>
-            <w:r/>
-            <w:r>
-              <w:rPr>
-                <w:sz w:val="17"/>
-              </w:rPr>
-              <w:t>Other group members</w:t>
-            </w:r>
-          </w:p>
-        </w:tc>
-        <w:tc>
-          <w:tcPr>
-            <w:tcW w:type="dxa" w:w="5184"/>
-          </w:tcPr>
-          <w:p>
-            <w:pPr>
-              <w:spacing w:after="0"/>
-            </w:pPr>
-            <w:r/>
-            <w:r>
-              <w:rPr>
-                <w:sz w:val="17"/>
-              </w:rPr>
-              <w:t>[to be filled in if applicable]</w:t>
             </w:r>
           </w:p>
         </w:tc>

</xml_diff>

<commit_message>
Add faculty name and submission date to report
Co-Authored-By: Claude Sonnet 5.5 <noreply@anthropic.com>
Claude-Session: https://claude.ai/code/session_01GtPcDJLiBtC54H93jMoEqQ
</commit_message>
<xml_diff>
--- a/student-recommendation-platform/report/Software_Engineering_Mini_Project_Report.docx
+++ b/student-recommendation-platform/report/Software_Engineering_Mini_Project_Report.docx
@@ -465,7 +465,7 @@
               <w:rPr>
                 <w:sz w:val="17"/>
               </w:rPr>
-              <w:t>[to be filled in]</w:t>
+              <w:t>Dr. Prashasti Kanikar</w:t>
             </w:r>
           </w:p>
         </w:tc>
@@ -504,7 +504,7 @@
               <w:rPr>
                 <w:sz w:val="17"/>
               </w:rPr>
-              <w:t>[to be filled in]</w:t>
+              <w:t>18/10/2026</w:t>
             </w:r>
           </w:p>
         </w:tc>

</xml_diff>